<commit_message>
Oficios: cabecalho do modelo Word no padrao (escudo a esquerda + unidade em caixa alta a esquerda)
Antes o cabecalho vinha todo centralizado. Refeito espelhando o .of-head do
painel (flex-start): escudo a esquerda e as 4 linhas da unidade ao lado, em
CAIXA ALTA, negrito e alinhadas a esquerda, via tabela sem bordas.

Co-Authored-By: Claude Opus 4.8 <noreply@anthropic.com>
Claude-Session: https://claude.ai/code/session_01J3hp7h32eoXvVxuBHiiHcj
</commit_message>
<xml_diff>
--- a/src/assets/modelo-oficio-saida.docx
+++ b/src/assets/modelo-oficio-saida.docx
@@ -2,104 +2,144 @@
 <file path=word/document.xml><?xml version="1.0" encoding="utf-8"?>
 <w:document xmlns:wpc="http://schemas.microsoft.com/office/word/2010/wordprocessingCanvas" xmlns:mo="http://schemas.microsoft.com/office/mac/office/2008/main" xmlns:mc="http://schemas.openxmlformats.org/markup-compatibility/2006" xmlns:mv="urn:schemas-microsoft-com:mac:vml" xmlns:o="urn:schemas-microsoft-com:office:office" xmlns:r="http://schemas.openxmlformats.org/officeDocument/2006/relationships" xmlns:m="http://schemas.openxmlformats.org/officeDocument/2006/math" xmlns:v="urn:schemas-microsoft-com:vml" xmlns:wp14="http://schemas.microsoft.com/office/word/2010/wordprocessingDrawing" xmlns:wp="http://schemas.openxmlformats.org/drawingml/2006/wordprocessingDrawing" xmlns:w10="urn:schemas-microsoft-com:office:word" xmlns:w="http://schemas.openxmlformats.org/wordprocessingml/2006/main" xmlns:w14="http://schemas.microsoft.com/office/word/2010/wordml" xmlns:wpg="http://schemas.microsoft.com/office/word/2010/wordprocessingGroup" xmlns:wpi="http://schemas.microsoft.com/office/word/2010/wordprocessingInk" xmlns:wne="http://schemas.microsoft.com/office/word/2006/wordml" xmlns:wps="http://schemas.microsoft.com/office/word/2010/wordprocessingShape" mc:Ignorable="w14 wp14">
   <w:body>
+    <w:tbl>
+      <w:tblPr>
+        <w:tblW w:type="auto" w:w="0"/>
+        <w:jc w:val="left"/>
+        <w:tblLayout w:type="fixed"/>
+        <w:tblLook w:firstColumn="1" w:firstRow="1" w:lastColumn="0" w:lastRow="0" w:noHBand="0" w:noVBand="1" w:val="04A0"/>
+        <w:tblBorders>
+          <w:top w:val="none"/>
+          <w:left w:val="none"/>
+          <w:bottom w:val="none"/>
+          <w:right w:val="none"/>
+          <w:insideH w:val="none"/>
+          <w:insideV w:val="none"/>
+        </w:tblBorders>
+      </w:tblPr>
+      <w:tblGrid>
+        <w:gridCol w:w="4394"/>
+        <w:gridCol w:w="4394"/>
+      </w:tblGrid>
+      <w:tr>
+        <w:tc>
+          <w:tcPr>
+            <w:tcW w:type="dxa" w:w="1474"/>
+            <w:vAlign w:val="center"/>
+          </w:tcPr>
+          <w:p>
+            <w:pPr>
+              <w:spacing w:after="0"/>
+              <w:jc w:val="left"/>
+            </w:pPr>
+            <w:r>
+              <w:drawing>
+                <wp:inline xmlns:a="http://schemas.openxmlformats.org/drawingml/2006/main" xmlns:pic="http://schemas.openxmlformats.org/drawingml/2006/picture">
+                  <wp:extent cx="674100" cy="756000"/>
+                  <wp:docPr id="1" name="Picture 1"/>
+                  <wp:cNvGraphicFramePr>
+                    <a:graphicFrameLocks noChangeAspect="1"/>
+                  </wp:cNvGraphicFramePr>
+                  <a:graphic>
+                    <a:graphicData uri="http://schemas.openxmlformats.org/drawingml/2006/picture">
+                      <pic:pic>
+                        <pic:nvPicPr>
+                          <pic:cNvPr id="0" name="escudo-pmmg.png"/>
+                          <pic:cNvPicPr/>
+                        </pic:nvPicPr>
+                        <pic:blipFill>
+                          <a:blip r:embed="rId9"/>
+                          <a:stretch>
+                            <a:fillRect/>
+                          </a:stretch>
+                        </pic:blipFill>
+                        <pic:spPr>
+                          <a:xfrm>
+                            <a:off x="0" y="0"/>
+                            <a:ext cx="674100" cy="756000"/>
+                          </a:xfrm>
+                          <a:prstGeom prst="rect"/>
+                        </pic:spPr>
+                      </pic:pic>
+                    </a:graphicData>
+                  </a:graphic>
+                </wp:inline>
+              </w:drawing>
+            </w:r>
+          </w:p>
+        </w:tc>
+        <w:tc>
+          <w:tcPr>
+            <w:tcW w:type="dxa" w:w="7597"/>
+            <w:vAlign w:val="center"/>
+          </w:tcPr>
+          <w:p>
+            <w:pPr>
+              <w:spacing w:after="0" w:line="276" w:lineRule="auto"/>
+              <w:jc w:val="left"/>
+            </w:pPr>
+            <w:r>
+              <w:rPr>
+                <w:rFonts w:ascii="Arial" w:hAnsi="Arial" w:eastAsia="Arial"/>
+                <w:b/>
+                <w:i w:val="0"/>
+                <w:sz w:val="20"/>
+              </w:rPr>
+              <w:t>POLÍCIA MILITAR DE MINAS GERAIS</w:t>
+            </w:r>
+          </w:p>
+          <w:p>
+            <w:pPr>
+              <w:spacing w:after="0" w:line="276" w:lineRule="auto"/>
+              <w:jc w:val="left"/>
+            </w:pPr>
+            <w:r>
+              <w:rPr>
+                <w:rFonts w:ascii="Arial" w:hAnsi="Arial" w:eastAsia="Arial"/>
+                <w:b/>
+                <w:i w:val="0"/>
+                <w:sz w:val="20"/>
+              </w:rPr>
+              <w:t>COMANDO DE POLICIAMENTO ESPECIALIZADO</w:t>
+            </w:r>
+          </w:p>
+          <w:p>
+            <w:pPr>
+              <w:spacing w:after="0" w:line="276" w:lineRule="auto"/>
+              <w:jc w:val="left"/>
+            </w:pPr>
+            <w:r>
+              <w:rPr>
+                <w:rFonts w:ascii="Arial" w:hAnsi="Arial" w:eastAsia="Arial"/>
+                <w:b/>
+                <w:i w:val="0"/>
+                <w:sz w:val="20"/>
+              </w:rPr>
+              <w:t>BATALHÃO DE POLÍCIA MILITAR DE MEIO AMBIENTE</w:t>
+            </w:r>
+          </w:p>
+          <w:p>
+            <w:pPr>
+              <w:spacing w:after="0" w:line="276" w:lineRule="auto"/>
+              <w:jc w:val="left"/>
+            </w:pPr>
+            <w:r>
+              <w:rPr>
+                <w:rFonts w:ascii="Arial" w:hAnsi="Arial" w:eastAsia="Arial"/>
+                <w:b/>
+                <w:i w:val="0"/>
+                <w:sz w:val="20"/>
+              </w:rPr>
+              <w:t>TERCEIRA COMPANHIA DE POLÍCIA MILITAR DE MEIO AMBIENTE</w:t>
+            </w:r>
+          </w:p>
+        </w:tc>
+      </w:tr>
+    </w:tbl>
     <w:p>
       <w:pPr>
-        <w:jc w:val="center"/>
+        <w:spacing w:after="40"/>
       </w:pPr>
-      <w:r>
-        <w:drawing>
-          <wp:inline xmlns:a="http://schemas.openxmlformats.org/drawingml/2006/main" xmlns:pic="http://schemas.openxmlformats.org/drawingml/2006/picture">
-            <wp:extent cx="706200" cy="792000"/>
-            <wp:docPr id="1" name="Picture 1"/>
-            <wp:cNvGraphicFramePr>
-              <a:graphicFrameLocks noChangeAspect="1"/>
-            </wp:cNvGraphicFramePr>
-            <a:graphic>
-              <a:graphicData uri="http://schemas.openxmlformats.org/drawingml/2006/picture">
-                <pic:pic>
-                  <pic:nvPicPr>
-                    <pic:cNvPr id="0" name="escudo-pmmg.png"/>
-                    <pic:cNvPicPr/>
-                  </pic:nvPicPr>
-                  <pic:blipFill>
-                    <a:blip r:embed="rId9"/>
-                    <a:stretch>
-                      <a:fillRect/>
-                    </a:stretch>
-                  </pic:blipFill>
-                  <pic:spPr>
-                    <a:xfrm>
-                      <a:off x="0" y="0"/>
-                      <a:ext cx="706200" cy="792000"/>
-                    </a:xfrm>
-                    <a:prstGeom prst="rect"/>
-                  </pic:spPr>
-                </pic:pic>
-              </a:graphicData>
-            </a:graphic>
-          </wp:inline>
-        </w:drawing>
-      </w:r>
-    </w:p>
-    <w:p>
-      <w:pPr>
-        <w:spacing w:after="0"/>
-        <w:jc w:val="center"/>
-      </w:pPr>
-      <w:r>
-        <w:rPr>
-          <w:rFonts w:ascii="Arial" w:hAnsi="Arial" w:eastAsia="Arial"/>
-          <w:b/>
-          <w:i w:val="0"/>
-          <w:sz w:val="22"/>
-        </w:rPr>
-        <w:t>Polícia Militar de Minas Gerais</w:t>
-      </w:r>
-    </w:p>
-    <w:p>
-      <w:pPr>
-        <w:spacing w:after="0"/>
-        <w:jc w:val="center"/>
-      </w:pPr>
-      <w:r>
-        <w:rPr>
-          <w:rFonts w:ascii="Arial" w:hAnsi="Arial" w:eastAsia="Arial"/>
-          <w:b w:val="0"/>
-          <w:i w:val="0"/>
-          <w:sz w:val="22"/>
-        </w:rPr>
-        <w:t>Comando de Policiamento Especializado</w:t>
-      </w:r>
-    </w:p>
-    <w:p>
-      <w:pPr>
-        <w:spacing w:after="0"/>
-        <w:jc w:val="center"/>
-      </w:pPr>
-      <w:r>
-        <w:rPr>
-          <w:rFonts w:ascii="Arial" w:hAnsi="Arial" w:eastAsia="Arial"/>
-          <w:b w:val="0"/>
-          <w:i w:val="0"/>
-          <w:sz w:val="22"/>
-        </w:rPr>
-        <w:t>Batalhão de Polícia Militar de Meio Ambiente</w:t>
-      </w:r>
-    </w:p>
-    <w:p>
-      <w:pPr>
-        <w:spacing w:after="0"/>
-        <w:jc w:val="center"/>
-      </w:pPr>
-      <w:r>
-        <w:rPr>
-          <w:rFonts w:ascii="Arial" w:hAnsi="Arial" w:eastAsia="Arial"/>
-          <w:b w:val="0"/>
-          <w:i w:val="0"/>
-          <w:sz w:val="22"/>
-        </w:rPr>
-        <w:t>Terceira Companhia de Polícia Militar de Meio Ambiente</w:t>
-      </w:r>
     </w:p>
     <w:p>
       <w:pPr>

</xml_diff>